<commit_message>
feat: V17 Tank Ledger, Tiered Market Slippage, and aFRR Engine
</commit_message>
<xml_diff>
--- a/Additions.docx
+++ b/Additions.docx
@@ -7,6 +7,50 @@
         <w:rPr>
           <w:b/>
           <w:bCs/>
+          <w:lang w:val="en-US"/>
+        </w:rPr>
+      </w:pPr>
+      <w:proofErr w:type="spellStart"/>
+      <w:r>
+        <w:rPr>
+          <w:b/>
+          <w:bCs/>
+          <w:lang w:val="en-US"/>
+        </w:rPr>
+        <w:t>Tennet</w:t>
+      </w:r>
+      <w:proofErr w:type="spellEnd"/>
+      <w:r>
+        <w:rPr>
+          <w:b/>
+          <w:bCs/>
+          <w:lang w:val="en-US"/>
+        </w:rPr>
+        <w:t xml:space="preserve"> API key, </w:t>
+      </w:r>
+      <w:r>
+        <w:rPr>
+          <w:b/>
+          <w:bCs/>
+          <w:lang w:val="en-US"/>
+        </w:rPr>
+        <w:t>085bf0ad-a062-4f84-ad4b-d265ee5a6e98</w:t>
+      </w:r>
+    </w:p>
+    <w:p>
+      <w:pPr>
+        <w:rPr>
+          <w:b/>
+          <w:bCs/>
+          <w:lang w:val="en-US"/>
+        </w:rPr>
+      </w:pPr>
+    </w:p>
+    <w:p>
+      <w:pPr>
+        <w:rPr>
+          <w:b/>
+          <w:bCs/>
         </w:rPr>
       </w:pPr>
       <w:r>
@@ -206,14 +250,11 @@
           <w:b/>
           <w:bCs/>
         </w:rPr>
+        <w:lastRenderedPageBreak/>
         <w:t>The Upgrade:</w:t>
       </w:r>
       <w:r>
-        <w:t xml:space="preserve"> Expand the data_ingestion.py script to fetch prices for Germany (DE), Belgium (BE), and the UK (GB). Add a dropdown to the Streamlit UI allowing the user </w:t>
-      </w:r>
-      <w:r>
-        <w:lastRenderedPageBreak/>
-        <w:t>to select the country. This turns your MVP into a geographic investment tool to find out which European market yields the highest ROI for a specific battery configuration.</w:t>
+        <w:t xml:space="preserve"> Expand the data_ingestion.py script to fetch prices for Germany (DE), Belgium (BE), and the UK (GB). Add a dropdown to the Streamlit UI allowing the user to select the country. This turns your MVP into a geographic investment tool to find out which European market yields the highest ROI for a specific battery configuration.</w:t>
       </w:r>
     </w:p>
     <w:p>
@@ -316,8 +357,470 @@
           <w:lang w:val="en-US"/>
         </w:rPr>
       </w:pPr>
-      <w:r>
-        <w:t>I want to visualise all the data the training data used for the forecasting just for my understanding and making strategy to improve its forecasting. We can implement it somewhere outside of my main MVP like a debugging environment.</w:t>
+    </w:p>
+    <w:p>
+      <w:pPr>
+        <w:rPr>
+          <w:lang w:val="en-US"/>
+        </w:rPr>
+      </w:pPr>
+    </w:p>
+    <w:p>
+      <w:pPr>
+        <w:rPr>
+          <w:lang w:val="en-US"/>
+        </w:rPr>
+      </w:pPr>
+    </w:p>
+    <w:p>
+      <w:pPr>
+        <w:rPr>
+          <w:lang w:val="en-US"/>
+        </w:rPr>
+      </w:pPr>
+    </w:p>
+    <w:p>
+      <w:pPr>
+        <w:rPr>
+          <w:lang w:val="en-US"/>
+        </w:rPr>
+      </w:pPr>
+    </w:p>
+    <w:p>
+      <w:pPr>
+        <w:rPr>
+          <w:lang w:val="en-US"/>
+        </w:rPr>
+      </w:pPr>
+    </w:p>
+    <w:p>
+      <w:pPr>
+        <w:rPr>
+          <w:lang w:val="en-US"/>
+        </w:rPr>
+      </w:pPr>
+    </w:p>
+    <w:p>
+      <w:pPr>
+        <w:rPr>
+          <w:lang w:val="en-US"/>
+        </w:rPr>
+      </w:pPr>
+    </w:p>
+    <w:p>
+      <w:pPr>
+        <w:rPr>
+          <w:lang w:val="en-US"/>
+        </w:rPr>
+      </w:pPr>
+    </w:p>
+    <w:p>
+      <w:pPr>
+        <w:rPr>
+          <w:lang w:val="en-US"/>
+        </w:rPr>
+      </w:pPr>
+    </w:p>
+    <w:p>
+      <w:pPr>
+        <w:rPr>
+          <w:lang w:val="en-US"/>
+        </w:rPr>
+      </w:pPr>
+    </w:p>
+    <w:p>
+      <w:pPr>
+        <w:rPr>
+          <w:lang w:val="en-US"/>
+        </w:rPr>
+      </w:pPr>
+    </w:p>
+    <w:p>
+      <w:pPr>
+        <w:rPr>
+          <w:b/>
+          <w:bCs/>
+          <w:lang w:val="en-US"/>
+        </w:rPr>
+      </w:pPr>
+      <w:r>
+        <w:rPr>
+          <w:b/>
+          <w:bCs/>
+        </w:rPr>
+        <w:lastRenderedPageBreak/>
+        <w:t>BESS Architecture &amp; Market Reality Audit</w:t>
+      </w:r>
+    </w:p>
+    <w:p>
+      <w:pPr>
+        <w:rPr>
+          <w:b/>
+          <w:bCs/>
+        </w:rPr>
+      </w:pPr>
+      <w:r>
+        <w:rPr>
+          <w:b/>
+          <w:bCs/>
+        </w:rPr>
+        <w:t>1. Financial Engine: The COGS Accounting Deficit</w:t>
+      </w:r>
+    </w:p>
+    <w:p>
+      <w:r>
+        <w:rPr>
+          <w:b/>
+          <w:bCs/>
+        </w:rPr>
+        <w:t>Target:</w:t>
+      </w:r>
+      <w:r>
+        <w:t xml:space="preserve"> finance_engine_5.py &amp; app_5.py </w:t>
+      </w:r>
+      <w:r>
+        <w:rPr>
+          <w:b/>
+          <w:bCs/>
+        </w:rPr>
+        <w:t>The Flaw:</w:t>
+      </w:r>
+      <w:r>
+        <w:t xml:space="preserve"> As we discussed, the current engine pools all charging costs into a single Total_Charging_Cost_EUR bucket. Looking at the image_355dc1.png dashboard, Charging Costs consume 66% of the cost structure pie, while DA Revenue only makes up 25% of the revenue pie. To an untrained investor, Day-Ahead Arbitrage looks like a massive net loss. </w:t>
+      </w:r>
+      <w:r>
+        <w:rPr>
+          <w:b/>
+          <w:bCs/>
+        </w:rPr>
+        <w:t>The Fix:</w:t>
+      </w:r>
+      <w:r>
+        <w:t xml:space="preserve"> We must implement </w:t>
+      </w:r>
+      <w:r>
+        <w:rPr>
+          <w:b/>
+          <w:bCs/>
+        </w:rPr>
+        <w:t>Volume-Weighted COGS Allocation</w:t>
+      </w:r>
+      <w:r>
+        <w:t>.</w:t>
+      </w:r>
+    </w:p>
+    <w:p>
+      <w:pPr>
+        <w:numPr>
+          <w:ilvl w:val="0"/>
+          <w:numId w:val="6"/>
+        </w:numPr>
+      </w:pPr>
+      <w:r>
+        <w:t>We calculate the total physical MWh discharged to the DA market versus the physical MWh discharged for aFRR activations.</w:t>
+      </w:r>
+    </w:p>
+    <w:p>
+      <w:pPr>
+        <w:numPr>
+          <w:ilvl w:val="0"/>
+          <w:numId w:val="6"/>
+        </w:numPr>
+      </w:pPr>
+      <w:r>
+        <w:t>We convert these to proportional fractions (e.g., 60% DA, 40% aFRR).</w:t>
+      </w:r>
+    </w:p>
+    <w:p>
+      <w:pPr>
+        <w:numPr>
+          <w:ilvl w:val="0"/>
+          <w:numId w:val="6"/>
+        </w:numPr>
+      </w:pPr>
+      <w:r>
+        <w:t>We split the total_charging_cost by these fractions into DA_COGS and aFRR_COGS.</w:t>
+      </w:r>
+    </w:p>
+    <w:p>
+      <w:pPr>
+        <w:numPr>
+          <w:ilvl w:val="0"/>
+          <w:numId w:val="6"/>
+        </w:numPr>
+      </w:pPr>
+      <w:r>
+        <w:t xml:space="preserve">We export these Net Revenues to app_5.py to rebuild the Waterfall Chart so it accurately reflects the </w:t>
+      </w:r>
+      <w:r>
+        <w:rPr>
+          <w:i/>
+          <w:iCs/>
+        </w:rPr>
+        <w:t>true</w:t>
+      </w:r>
+      <w:r>
+        <w:t xml:space="preserve"> profitability of each market strategy.</w:t>
+      </w:r>
+    </w:p>
+    <w:p>
+      <w:pPr>
+        <w:rPr>
+          <w:b/>
+          <w:bCs/>
+        </w:rPr>
+      </w:pPr>
+      <w:r>
+        <w:rPr>
+          <w:b/>
+          <w:bCs/>
+        </w:rPr>
+        <w:t>2. Quant Engine: The Activation Penalty Bug</w:t>
+      </w:r>
+    </w:p>
+    <w:p>
+      <w:r>
+        <w:rPr>
+          <w:b/>
+          <w:bCs/>
+        </w:rPr>
+        <w:t>Target:</w:t>
+      </w:r>
+      <w:r>
+        <w:t xml:space="preserve"> quant_engine_5.py </w:t>
+      </w:r>
+      <w:r>
+        <w:rPr>
+          <w:b/>
+          <w:bCs/>
+        </w:rPr>
+        <w:t>The Flaw:</w:t>
+      </w:r>
+      <w:r>
+        <w:t xml:space="preserve"> I found a critical mathematical bug in your Linear Programming topology. If you look at quant_engine_5.py around line 73, you calculate the proxy: activation_reward_proxy = prices_df_naive.get('forecast_price', pd.Series(0.0, ...)) However, on line 78, when you instantiate the aFRR_Up_Activation link, you set: marginal_cost=degradation_penalty</w:t>
+      </w:r>
+    </w:p>
+    <w:p>
+      <w:r>
+        <w:rPr>
+          <w:b/>
+          <w:bCs/>
+        </w:rPr>
+        <w:t>The Impact:</w:t>
+      </w:r>
+      <w:r>
+        <w:t xml:space="preserve"> The hotfix to subtract the reward proxy was lost! The PyPSA solver currently believes that physically activating the battery for aFRR yields €0 revenue but incurs a €5/MWh degradation penalty. The solver is mathematically treating physical activation as a pure financial loss, heavily suppressing your asset's willingness to bid into the aFRR market.</w:t>
+      </w:r>
+    </w:p>
+    <w:p>
+      <w:pPr>
+        <w:rPr>
+          <w:b/>
+          <w:bCs/>
+        </w:rPr>
+      </w:pPr>
+      <w:r>
+        <w:rPr>
+          <w:b/>
+          <w:bCs/>
+        </w:rPr>
+        <w:t>4. Market Reality: The "Flat 15%" Activation Fallacy</w:t>
+      </w:r>
+    </w:p>
+    <w:p>
+      <w:r>
+        <w:rPr>
+          <w:b/>
+          <w:bCs/>
+        </w:rPr>
+        <w:t>Target:</w:t>
+      </w:r>
+      <w:r>
+        <w:t xml:space="preserve"> quant_engine_5.py </w:t>
+      </w:r>
+      <w:r>
+        <w:rPr>
+          <w:b/>
+          <w:bCs/>
+        </w:rPr>
+        <w:t>The Flaw:</w:t>
+      </w:r>
+      <w:r>
+        <w:t xml:space="preserve"> The constraint afrr_activation == afrr_up * 0.15 assumes a perfectly static 15% activation rate for every 15-minute block of the year. </w:t>
+      </w:r>
+      <w:r>
+        <w:rPr>
+          <w:b/>
+          <w:bCs/>
+        </w:rPr>
+        <w:t>The Market Reality:</w:t>
+      </w:r>
+      <w:r>
+        <w:t xml:space="preserve"> TenneT only activates reserves when the grid is imbalanced. If the grid is long (too much power), aFRR_Up is activated 0%. If the grid is severely short, aFRR_Up might be activated 80%. </w:t>
+      </w:r>
+      <w:r>
+        <w:rPr>
+          <w:b/>
+          <w:bCs/>
+        </w:rPr>
+        <w:t>The Fix:</w:t>
+      </w:r>
+      <w:r>
+        <w:t xml:space="preserve"> Since we already ingest imbalance_price_15m in data_ingestion_5.py, we should map historical activation probabilities dynamically to the imbalance price state. If the forecast imbalance is massive, the expected activation rate should mathematically spike in the LP constraints.</w:t>
+      </w:r>
+    </w:p>
+    <w:p>
+      <w:pPr>
+        <w:rPr>
+          <w:b/>
+          <w:bCs/>
+        </w:rPr>
+      </w:pPr>
+      <w:r>
+        <w:rPr>
+          <w:b/>
+          <w:bCs/>
+        </w:rPr>
+        <w:t>5. Physical Reality: Calendar Aging &amp; Resting SOC</w:t>
+      </w:r>
+    </w:p>
+    <w:p>
+      <w:r>
+        <w:rPr>
+          <w:b/>
+          <w:bCs/>
+        </w:rPr>
+        <w:lastRenderedPageBreak/>
+        <w:t>Target:</w:t>
+      </w:r>
+      <w:r>
+        <w:t xml:space="preserve"> finance_engine_5.py </w:t>
+      </w:r>
+      <w:r>
+        <w:rPr>
+          <w:b/>
+          <w:bCs/>
+        </w:rPr>
+        <w:t>The Flaw:</w:t>
+      </w:r>
+      <w:r>
+        <w:t xml:space="preserve"> Our degradation model (Annual_Degradation_Cost_EUR) relies purely on Equivalent Full Cycles (EFC). </w:t>
+      </w:r>
+      <w:r>
+        <w:rPr>
+          <w:b/>
+          <w:bCs/>
+        </w:rPr>
+        <w:t>The Physical Reality:</w:t>
+      </w:r>
+      <w:r>
+        <w:t xml:space="preserve"> Lithium Iron Phosphate (LFP) cells degrade even when sitting idle, and they degrade faster if they sit idle at 100% State of Charge (SoC). Real trading desks use penalty functions to force the battery to rest at ~50% SoC when not trading to preserve cell health. Currently, if PyPSA finishes a morning trade, it might sit at 100% SoC for 12 hours waiting for the evening peak, which physically destroys the battery.</w:t>
+      </w:r>
+    </w:p>
+    <w:p>
+      <w:pPr>
+        <w:rPr>
+          <w:lang w:val="en-US"/>
+        </w:rPr>
+      </w:pPr>
+    </w:p>
+    <w:p>
+      <w:pPr>
+        <w:rPr>
+          <w:lang w:val="en-US"/>
+        </w:rPr>
+      </w:pPr>
+    </w:p>
+    <w:p>
+      <w:pPr>
+        <w:rPr>
+          <w:lang w:val="en-US"/>
+        </w:rPr>
+      </w:pPr>
+    </w:p>
+    <w:p>
+      <w:pPr>
+        <w:rPr>
+          <w:b/>
+          <w:bCs/>
+          <w:lang w:val="en-US"/>
+        </w:rPr>
+      </w:pPr>
+      <w:r>
+        <w:rPr>
+          <w:b/>
+          <w:bCs/>
+          <w:lang w:val="en-US"/>
+        </w:rPr>
+        <w:t>Including temperature data to improve forecast</w:t>
+      </w:r>
+    </w:p>
+    <w:p>
+      <w:pPr>
+        <w:rPr>
+          <w:lang w:val="en-US"/>
+        </w:rPr>
+      </w:pPr>
+      <w:r>
+        <w:rPr>
+          <w:b/>
+          <w:bCs/>
+          <w:lang w:val="en-US"/>
+        </w:rPr>
+        <w:t xml:space="preserve">Multi horizon </w:t>
+      </w:r>
+      <w:proofErr w:type="spellStart"/>
+      <w:r>
+        <w:rPr>
+          <w:b/>
+          <w:bCs/>
+          <w:lang w:val="en-US"/>
+        </w:rPr>
+        <w:t>optimisation</w:t>
+      </w:r>
+      <w:proofErr w:type="spellEnd"/>
+      <w:r>
+        <w:rPr>
+          <w:b/>
+          <w:bCs/>
+          <w:lang w:val="en-US"/>
+        </w:rPr>
+        <w:br/>
+      </w:r>
+      <w:r>
+        <w:rPr>
+          <w:b/>
+          <w:bCs/>
+          <w:lang w:val="en-US"/>
+        </w:rPr>
+        <w:br/>
+        <w:t xml:space="preserve">Resolve the issue with strict </w:t>
+      </w:r>
+      <w:proofErr w:type="gramStart"/>
+      <w:r>
+        <w:rPr>
+          <w:b/>
+          <w:bCs/>
+          <w:lang w:val="en-US"/>
+        </w:rPr>
+        <w:t>15 year</w:t>
+      </w:r>
+      <w:proofErr w:type="gramEnd"/>
+      <w:r>
+        <w:rPr>
+          <w:b/>
+          <w:bCs/>
+          <w:lang w:val="en-US"/>
+        </w:rPr>
+        <w:t xml:space="preserve"> life cycle of the battery </w:t>
+      </w:r>
+      <w:r>
+        <w:rPr>
+          <w:b/>
+          <w:bCs/>
+          <w:lang w:val="en-US"/>
+        </w:rPr>
+        <w:br/>
       </w:r>
     </w:p>
     <w:sectPr>
@@ -482,6 +985,155 @@
     </w:lvl>
   </w:abstractNum>
   <w:abstractNum w:abstractNumId="1" w15:restartNumberingAfterBreak="0">
+    <w:nsid w:val="55CF1B4E"/>
+    <w:multiLevelType w:val="multilevel"/>
+    <w:tmpl w:val="4A50444E"/>
+    <w:lvl w:ilvl="0">
+      <w:start w:val="1"/>
+      <w:numFmt w:val="bullet"/>
+      <w:lvlText w:val=""/>
+      <w:lvlJc w:val="left"/>
+      <w:pPr>
+        <w:tabs>
+          <w:tab w:val="num" w:pos="720"/>
+        </w:tabs>
+        <w:ind w:left="720" w:hanging="360"/>
+      </w:pPr>
+      <w:rPr>
+        <w:rFonts w:ascii="Symbol" w:hAnsi="Symbol" w:hint="default"/>
+        <w:sz w:val="20"/>
+      </w:rPr>
+    </w:lvl>
+    <w:lvl w:ilvl="1" w:tentative="1">
+      <w:start w:val="1"/>
+      <w:numFmt w:val="bullet"/>
+      <w:lvlText w:val="o"/>
+      <w:lvlJc w:val="left"/>
+      <w:pPr>
+        <w:tabs>
+          <w:tab w:val="num" w:pos="1440"/>
+        </w:tabs>
+        <w:ind w:left="1440" w:hanging="360"/>
+      </w:pPr>
+      <w:rPr>
+        <w:rFonts w:ascii="Courier New" w:hAnsi="Courier New" w:hint="default"/>
+        <w:sz w:val="20"/>
+      </w:rPr>
+    </w:lvl>
+    <w:lvl w:ilvl="2" w:tentative="1">
+      <w:start w:val="1"/>
+      <w:numFmt w:val="bullet"/>
+      <w:lvlText w:val=""/>
+      <w:lvlJc w:val="left"/>
+      <w:pPr>
+        <w:tabs>
+          <w:tab w:val="num" w:pos="2160"/>
+        </w:tabs>
+        <w:ind w:left="2160" w:hanging="360"/>
+      </w:pPr>
+      <w:rPr>
+        <w:rFonts w:ascii="Wingdings" w:hAnsi="Wingdings" w:hint="default"/>
+        <w:sz w:val="20"/>
+      </w:rPr>
+    </w:lvl>
+    <w:lvl w:ilvl="3" w:tentative="1">
+      <w:start w:val="1"/>
+      <w:numFmt w:val="bullet"/>
+      <w:lvlText w:val=""/>
+      <w:lvlJc w:val="left"/>
+      <w:pPr>
+        <w:tabs>
+          <w:tab w:val="num" w:pos="2880"/>
+        </w:tabs>
+        <w:ind w:left="2880" w:hanging="360"/>
+      </w:pPr>
+      <w:rPr>
+        <w:rFonts w:ascii="Wingdings" w:hAnsi="Wingdings" w:hint="default"/>
+        <w:sz w:val="20"/>
+      </w:rPr>
+    </w:lvl>
+    <w:lvl w:ilvl="4" w:tentative="1">
+      <w:start w:val="1"/>
+      <w:numFmt w:val="bullet"/>
+      <w:lvlText w:val=""/>
+      <w:lvlJc w:val="left"/>
+      <w:pPr>
+        <w:tabs>
+          <w:tab w:val="num" w:pos="3600"/>
+        </w:tabs>
+        <w:ind w:left="3600" w:hanging="360"/>
+      </w:pPr>
+      <w:rPr>
+        <w:rFonts w:ascii="Wingdings" w:hAnsi="Wingdings" w:hint="default"/>
+        <w:sz w:val="20"/>
+      </w:rPr>
+    </w:lvl>
+    <w:lvl w:ilvl="5" w:tentative="1">
+      <w:start w:val="1"/>
+      <w:numFmt w:val="bullet"/>
+      <w:lvlText w:val=""/>
+      <w:lvlJc w:val="left"/>
+      <w:pPr>
+        <w:tabs>
+          <w:tab w:val="num" w:pos="4320"/>
+        </w:tabs>
+        <w:ind w:left="4320" w:hanging="360"/>
+      </w:pPr>
+      <w:rPr>
+        <w:rFonts w:ascii="Wingdings" w:hAnsi="Wingdings" w:hint="default"/>
+        <w:sz w:val="20"/>
+      </w:rPr>
+    </w:lvl>
+    <w:lvl w:ilvl="6" w:tentative="1">
+      <w:start w:val="1"/>
+      <w:numFmt w:val="bullet"/>
+      <w:lvlText w:val=""/>
+      <w:lvlJc w:val="left"/>
+      <w:pPr>
+        <w:tabs>
+          <w:tab w:val="num" w:pos="5040"/>
+        </w:tabs>
+        <w:ind w:left="5040" w:hanging="360"/>
+      </w:pPr>
+      <w:rPr>
+        <w:rFonts w:ascii="Wingdings" w:hAnsi="Wingdings" w:hint="default"/>
+        <w:sz w:val="20"/>
+      </w:rPr>
+    </w:lvl>
+    <w:lvl w:ilvl="7" w:tentative="1">
+      <w:start w:val="1"/>
+      <w:numFmt w:val="bullet"/>
+      <w:lvlText w:val=""/>
+      <w:lvlJc w:val="left"/>
+      <w:pPr>
+        <w:tabs>
+          <w:tab w:val="num" w:pos="5760"/>
+        </w:tabs>
+        <w:ind w:left="5760" w:hanging="360"/>
+      </w:pPr>
+      <w:rPr>
+        <w:rFonts w:ascii="Wingdings" w:hAnsi="Wingdings" w:hint="default"/>
+        <w:sz w:val="20"/>
+      </w:rPr>
+    </w:lvl>
+    <w:lvl w:ilvl="8" w:tentative="1">
+      <w:start w:val="1"/>
+      <w:numFmt w:val="bullet"/>
+      <w:lvlText w:val=""/>
+      <w:lvlJc w:val="left"/>
+      <w:pPr>
+        <w:tabs>
+          <w:tab w:val="num" w:pos="6480"/>
+        </w:tabs>
+        <w:ind w:left="6480" w:hanging="360"/>
+      </w:pPr>
+      <w:rPr>
+        <w:rFonts w:ascii="Wingdings" w:hAnsi="Wingdings" w:hint="default"/>
+        <w:sz w:val="20"/>
+      </w:rPr>
+    </w:lvl>
+  </w:abstractNum>
+  <w:abstractNum w:abstractNumId="2" w15:restartNumberingAfterBreak="0">
     <w:nsid w:val="5B936DE5"/>
     <w:multiLevelType w:val="multilevel"/>
     <w:tmpl w:val="7AD80DAC"/>
@@ -630,7 +1282,7 @@
       </w:rPr>
     </w:lvl>
   </w:abstractNum>
-  <w:abstractNum w:abstractNumId="2" w15:restartNumberingAfterBreak="0">
+  <w:abstractNum w:abstractNumId="3" w15:restartNumberingAfterBreak="0">
     <w:nsid w:val="627C6DCB"/>
     <w:multiLevelType w:val="multilevel"/>
     <w:tmpl w:val="906C1718"/>
@@ -779,7 +1431,7 @@
       </w:rPr>
     </w:lvl>
   </w:abstractNum>
-  <w:abstractNum w:abstractNumId="3" w15:restartNumberingAfterBreak="0">
+  <w:abstractNum w:abstractNumId="4" w15:restartNumberingAfterBreak="0">
     <w:nsid w:val="6DFA718A"/>
     <w:multiLevelType w:val="multilevel"/>
     <w:tmpl w:val="397A69B2"/>
@@ -928,7 +1580,7 @@
       </w:rPr>
     </w:lvl>
   </w:abstractNum>
-  <w:abstractNum w:abstractNumId="4" w15:restartNumberingAfterBreak="0">
+  <w:abstractNum w:abstractNumId="5" w15:restartNumberingAfterBreak="0">
     <w:nsid w:val="7ADB0806"/>
     <w:multiLevelType w:val="multilevel"/>
     <w:tmpl w:val="02A4CA82"/>
@@ -1078,19 +1730,22 @@
     </w:lvl>
   </w:abstractNum>
   <w:num w:numId="1" w16cid:durableId="846872155">
-    <w:abstractNumId w:val="3"/>
+    <w:abstractNumId w:val="4"/>
   </w:num>
   <w:num w:numId="2" w16cid:durableId="2066097191">
-    <w:abstractNumId w:val="1"/>
+    <w:abstractNumId w:val="2"/>
   </w:num>
   <w:num w:numId="3" w16cid:durableId="490609087">
     <w:abstractNumId w:val="0"/>
   </w:num>
   <w:num w:numId="4" w16cid:durableId="1004936596">
-    <w:abstractNumId w:val="2"/>
+    <w:abstractNumId w:val="3"/>
   </w:num>
   <w:num w:numId="5" w16cid:durableId="841969273">
-    <w:abstractNumId w:val="4"/>
+    <w:abstractNumId w:val="5"/>
+  </w:num>
+  <w:num w:numId="6" w16cid:durableId="1928230868">
+    <w:abstractNumId w:val="1"/>
   </w:num>
 </w:numbering>
 </file>

</xml_diff>